<commit_message>
Correcion en codigos, y agregado codigo recursión funcionando correctamente.
</commit_message>
<xml_diff>
--- a/docs/Entrega 1_segunda_version.docx
+++ b/docs/Entrega 1_segunda_version.docx
@@ -1832,14 +1832,15 @@
     </w:p>
     <w:p>
       <w:pPr>
-        <w:numPr>
-          <w:ilvl w:val="0"/>
-          <w:numId w:val="0"/>
-        </w:numPr>
-        <w:ind w:leftChars="0"/>
-        <w:jc w:val="left"/>
-        <w:rPr>
-          <w:rFonts w:hint="default"/>
+        <w:pStyle w:val="8"/>
+        <w:keepNext w:val="0"/>
+        <w:keepLines w:val="0"/>
+        <w:widowControl/>
+        <w:suppressLineNumbers w:val="0"/>
+        <w:spacing w:before="0" w:beforeAutospacing="1" w:after="0" w:afterAutospacing="1"/>
+        <w:ind w:left="0" w:right="0"/>
+        <w:rPr>
+          <w:rFonts w:hint="default" w:ascii="Calibri" w:hAnsi="Calibri" w:cs="Calibri"/>
           <w:b/>
           <w:bCs/>
           <w:sz w:val="28"/>
@@ -1849,298 +1850,448 @@
       </w:pPr>
       <w:r>
         <w:rPr>
-          <w:rFonts w:hint="default"/>
+          <w:rStyle w:val="6"/>
+          <w:rFonts w:hint="default" w:ascii="Calibri" w:hAnsi="Calibri" w:cs="Calibri"/>
           <w:b/>
           <w:bCs/>
           <w:sz w:val="28"/>
           <w:szCs w:val="28"/>
-          <w:lang w:val="es-ES"/>
-        </w:rPr>
-        <w:t>Análisis de complejidad:</w:t>
-      </w:r>
-    </w:p>
-    <w:p>
-      <w:pPr>
-        <w:numPr>
-          <w:ilvl w:val="0"/>
-          <w:numId w:val="0"/>
-        </w:numPr>
-        <w:ind w:leftChars="0"/>
-        <w:jc w:val="left"/>
-        <w:rPr>
-          <w:rFonts w:hint="default"/>
+        </w:rPr>
+        <w:t>Análisis de complejidad — Fuerza Bruta</w:t>
+      </w:r>
+      <w:r>
+        <w:rPr>
+          <w:rStyle w:val="6"/>
+          <w:rFonts w:hint="default" w:ascii="Calibri" w:hAnsi="Calibri" w:cs="Calibri"/>
           <w:b/>
           <w:bCs/>
           <w:sz w:val="28"/>
           <w:szCs w:val="28"/>
           <w:lang w:val="es-ES"/>
         </w:rPr>
-      </w:pPr>
-    </w:p>
-    <w:p>
-      <w:pPr>
-        <w:numPr>
-          <w:ilvl w:val="0"/>
-          <w:numId w:val="0"/>
-        </w:numPr>
-        <w:ind w:leftChars="0"/>
-        <w:jc w:val="left"/>
-        <w:rPr>
-          <w:rFonts w:hint="default"/>
+        <w:t>:</w:t>
+      </w:r>
+    </w:p>
+    <w:p>
+      <w:pPr>
+        <w:pStyle w:val="8"/>
+        <w:keepNext w:val="0"/>
+        <w:keepLines w:val="0"/>
+        <w:widowControl/>
+        <w:suppressLineNumbers w:val="0"/>
+        <w:spacing w:before="0" w:beforeAutospacing="1" w:after="0" w:afterAutospacing="1"/>
+        <w:ind w:left="0" w:right="0"/>
+        <w:rPr>
+          <w:rFonts w:hint="default" w:ascii="Calibri" w:hAnsi="Calibri" w:cs="Calibri"/>
+        </w:rPr>
+      </w:pPr>
+      <w:r>
+        <w:rPr>
+          <w:rStyle w:val="6"/>
+          <w:rFonts w:hint="default" w:ascii="Calibri" w:hAnsi="Calibri" w:cs="Calibri"/>
+        </w:rPr>
+        <w:t>Complejidad temporal: O((m+1)^n)</w:t>
+      </w:r>
+    </w:p>
+    <w:p>
+      <w:pPr>
+        <w:pStyle w:val="8"/>
+        <w:keepNext w:val="0"/>
+        <w:keepLines w:val="0"/>
+        <w:widowControl/>
+        <w:suppressLineNumbers w:val="0"/>
+        <w:spacing w:before="0" w:beforeAutospacing="1" w:after="0" w:afterAutospacing="1"/>
+        <w:ind w:left="0" w:right="0"/>
+        <w:rPr>
+          <w:rFonts w:hint="default" w:ascii="Calibri" w:hAnsi="Calibri" w:cs="Calibri"/>
+        </w:rPr>
+      </w:pPr>
+      <w:r>
+        <w:rPr>
+          <w:rFonts w:hint="default" w:ascii="Calibri" w:hAnsi="Calibri" w:cs="Calibri"/>
+        </w:rPr>
+        <w:t xml:space="preserve">La solución explora todas las formas posibles de asignar </w:t>
+      </w:r>
+      <w:r>
+        <w:rPr>
+          <w:rFonts w:hint="default" w:ascii="Calibri" w:hAnsi="Calibri" w:cs="Calibri"/>
           <w:b/>
           <w:bCs/>
-          <w:sz w:val="24"/>
-          <w:szCs w:val="24"/>
-          <w:lang w:val="es-ES"/>
-        </w:rPr>
-      </w:pPr>
-      <w:r>
-        <w:rPr>
-          <w:rFonts w:hint="default"/>
+          <w:lang w:val="es-ES"/>
+        </w:rPr>
+        <w:t>n</w:t>
+      </w:r>
+      <w:r>
+        <w:rPr>
+          <w:rFonts w:hint="default" w:ascii="Calibri" w:hAnsi="Calibri" w:cs="Calibri"/>
+        </w:rPr>
+        <w:t xml:space="preserve"> paquetes a </w:t>
+      </w:r>
+      <w:r>
+        <w:rPr>
+          <w:rFonts w:hint="default" w:ascii="Calibri" w:hAnsi="Calibri" w:cs="Calibri"/>
           <w:b/>
           <w:bCs/>
-          <w:sz w:val="24"/>
-          <w:szCs w:val="24"/>
-          <w:lang w:val="es-ES"/>
-        </w:rPr>
-        <w:t>Complejidad temporal: O(m^n)</w:t>
-      </w:r>
-    </w:p>
-    <w:p>
-      <w:pPr>
-        <w:numPr>
-          <w:ilvl w:val="0"/>
-          <w:numId w:val="0"/>
-        </w:numPr>
-        <w:ind w:leftChars="0"/>
-        <w:jc w:val="left"/>
-        <w:rPr>
-          <w:rFonts w:hint="default"/>
-          <w:b w:val="0"/>
-          <w:bCs w:val="0"/>
-          <w:sz w:val="24"/>
-          <w:szCs w:val="24"/>
-          <w:lang w:val="es-ES"/>
-        </w:rPr>
-      </w:pPr>
-      <w:r>
-        <w:rPr>
-          <w:rFonts w:hint="default"/>
-          <w:b w:val="0"/>
-          <w:bCs w:val="0"/>
-          <w:sz w:val="24"/>
-          <w:szCs w:val="24"/>
-          <w:lang w:val="es-ES"/>
-        </w:rPr>
-        <w:t>La solución explora todas las formas posibles de asignar n paquetes a m camiones. Para cada paquete hay m opciones (a qué camión va), y esto se repite para los n paquetes, lo que genera m^n combinaciones en total.</w:t>
-      </w:r>
-    </w:p>
-    <w:p>
-      <w:pPr>
-        <w:numPr>
-          <w:ilvl w:val="0"/>
-          <w:numId w:val="0"/>
-        </w:numPr>
-        <w:ind w:leftChars="0"/>
-        <w:jc w:val="left"/>
-        <w:rPr>
-          <w:rFonts w:hint="default"/>
-          <w:b w:val="0"/>
-          <w:bCs w:val="0"/>
-          <w:sz w:val="24"/>
-          <w:szCs w:val="24"/>
-          <w:lang w:val="es-ES"/>
-        </w:rPr>
-      </w:pPr>
-      <w:r>
-        <w:rPr>
-          <w:rFonts w:hint="default"/>
-          <w:b w:val="0"/>
-          <w:bCs w:val="0"/>
-          <w:sz w:val="24"/>
-          <w:szCs w:val="24"/>
-          <w:lang w:val="es-ES"/>
-        </w:rPr>
-        <w:t>Por ejemplo, con 5 paquetes y 2 camiones(ejemplo pequeño propuesto) se exploran 2^5 = 32 combinaciones.</w:t>
-      </w:r>
-    </w:p>
-    <w:p>
-      <w:pPr>
-        <w:numPr>
-          <w:ilvl w:val="0"/>
-          <w:numId w:val="0"/>
-        </w:numPr>
-        <w:ind w:leftChars="0"/>
-        <w:jc w:val="left"/>
-        <w:rPr>
-          <w:rFonts w:hint="default"/>
-          <w:b w:val="0"/>
-          <w:bCs w:val="0"/>
-          <w:sz w:val="24"/>
-          <w:szCs w:val="24"/>
-          <w:lang w:val="es-ES"/>
-        </w:rPr>
-      </w:pPr>
-      <w:r>
-        <w:rPr>
-          <w:rFonts w:hint="default"/>
-          <w:b w:val="0"/>
-          <w:bCs w:val="0"/>
-          <w:sz w:val="24"/>
-          <w:szCs w:val="24"/>
-          <w:lang w:val="es-ES"/>
-        </w:rPr>
-        <w:t xml:space="preserve">Con 15 paquetes y 4 camiones(ejemplo mediano) se exploran 4^15 = 1073741824 combinaciones. </w:t>
-      </w:r>
-    </w:p>
-    <w:p>
-      <w:pPr>
-        <w:numPr>
-          <w:ilvl w:val="0"/>
-          <w:numId w:val="0"/>
-        </w:numPr>
-        <w:ind w:leftChars="0"/>
-        <w:jc w:val="left"/>
-        <w:rPr>
-          <w:rFonts w:hint="default"/>
-          <w:b w:val="0"/>
-          <w:bCs w:val="0"/>
-          <w:sz w:val="24"/>
-          <w:szCs w:val="24"/>
-          <w:lang w:val="es-ES"/>
-        </w:rPr>
-      </w:pPr>
-      <w:r>
-        <w:rPr>
-          <w:rFonts w:hint="default"/>
-          <w:b w:val="0"/>
-          <w:bCs w:val="0"/>
-          <w:sz w:val="24"/>
-          <w:szCs w:val="24"/>
-          <w:lang w:val="es-ES"/>
-        </w:rPr>
-        <w:t>Con 40 paquetes y 8 camiones(ejemplo grande se exploran 8^40 combinaciones, un número tan grande que es computacionalmente inviable, es por eso que el sistema no arroja ni un resultado.</w:t>
-      </w:r>
-    </w:p>
-    <w:p>
-      <w:pPr>
-        <w:numPr>
-          <w:ilvl w:val="0"/>
-          <w:numId w:val="0"/>
-        </w:numPr>
-        <w:ind w:leftChars="0"/>
-        <w:jc w:val="left"/>
-        <w:rPr>
-          <w:rFonts w:hint="default"/>
-          <w:b w:val="0"/>
-          <w:bCs w:val="0"/>
-          <w:sz w:val="24"/>
-          <w:szCs w:val="24"/>
-          <w:lang w:val="es-ES"/>
-        </w:rPr>
-      </w:pPr>
-    </w:p>
-    <w:p>
-      <w:pPr>
-        <w:numPr>
-          <w:ilvl w:val="0"/>
-          <w:numId w:val="0"/>
-        </w:numPr>
-        <w:ind w:leftChars="0"/>
-        <w:jc w:val="left"/>
-        <w:rPr>
-          <w:rFonts w:hint="default"/>
+          <w:lang w:val="es-ES"/>
+        </w:rPr>
+        <w:t>m</w:t>
+      </w:r>
+      <w:r>
+        <w:rPr>
+          <w:rFonts w:hint="default" w:ascii="Calibri" w:hAnsi="Calibri" w:cs="Calibri"/>
+        </w:rPr>
+        <w:t xml:space="preserve"> camiones</w:t>
+      </w:r>
+      <w:r>
+        <w:rPr>
+          <w:rFonts w:hint="default" w:ascii="Calibri" w:hAnsi="Calibri" w:cs="Calibri"/>
+          <w:lang w:val="es-ES"/>
+        </w:rPr>
+        <w:t>.</w:t>
+      </w:r>
+      <w:r>
+        <w:rPr>
+          <w:rFonts w:hint="default" w:ascii="Calibri" w:hAnsi="Calibri" w:cs="Calibri"/>
+        </w:rPr>
+        <w:t xml:space="preserve"> Para cada paquete hay</w:t>
+      </w:r>
+      <w:r>
+        <w:rPr>
+          <w:rFonts w:hint="default" w:ascii="Calibri" w:hAnsi="Calibri" w:cs="Calibri"/>
+          <w:lang w:val="es-ES"/>
+        </w:rPr>
+        <w:t xml:space="preserve"> m+1</w:t>
+      </w:r>
+      <w:r>
+        <w:rPr>
+          <w:rFonts w:hint="default" w:ascii="Calibri" w:hAnsi="Calibri" w:cs="Calibri"/>
+        </w:rPr>
+        <w:t xml:space="preserve"> opciones (los </w:t>
+      </w:r>
+      <w:r>
+        <w:rPr>
+          <w:rFonts w:hint="default" w:ascii="Calibri" w:hAnsi="Calibri" w:cs="Calibri"/>
           <w:b/>
           <w:bCs/>
-          <w:sz w:val="24"/>
-          <w:szCs w:val="24"/>
-          <w:lang w:val="es-ES"/>
-        </w:rPr>
-      </w:pPr>
-      <w:r>
-        <w:rPr>
-          <w:rFonts w:hint="default"/>
+          <w:lang w:val="es-ES"/>
+        </w:rPr>
+        <w:t>m</w:t>
+      </w:r>
+      <w:r>
+        <w:rPr>
+          <w:rFonts w:hint="default" w:ascii="Calibri" w:hAnsi="Calibri" w:cs="Calibri"/>
+        </w:rPr>
+        <w:t xml:space="preserve"> camiones más la opción de no asignarlo), y esto se repite para los</w:t>
+      </w:r>
+      <w:r>
+        <w:rPr>
+          <w:rFonts w:hint="default" w:ascii="Calibri" w:hAnsi="Calibri" w:cs="Calibri"/>
+          <w:lang w:val="es-ES"/>
+        </w:rPr>
+        <w:t xml:space="preserve"> </w:t>
+      </w:r>
+      <w:r>
+        <w:rPr>
+          <w:rFonts w:hint="default" w:ascii="Calibri" w:hAnsi="Calibri" w:cs="Calibri"/>
           <w:b/>
           <w:bCs/>
-          <w:sz w:val="24"/>
-          <w:szCs w:val="24"/>
-          <w:lang w:val="es-ES"/>
-        </w:rPr>
-        <w:t>Complejidad espacial: O(n * m)</w:t>
-      </w:r>
-    </w:p>
-    <w:p>
-      <w:pPr>
-        <w:numPr>
-          <w:ilvl w:val="0"/>
-          <w:numId w:val="0"/>
-        </w:numPr>
-        <w:ind w:leftChars="0"/>
-        <w:jc w:val="left"/>
-        <w:rPr>
-          <w:rFonts w:hint="default"/>
-          <w:b w:val="0"/>
-          <w:bCs w:val="0"/>
-          <w:sz w:val="24"/>
-          <w:szCs w:val="24"/>
-          <w:lang w:val="es-ES"/>
-        </w:rPr>
-      </w:pPr>
-      <w:r>
-        <w:rPr>
-          <w:rFonts w:hint="default"/>
-          <w:b w:val="0"/>
-          <w:bCs w:val="0"/>
-          <w:sz w:val="24"/>
-          <w:szCs w:val="24"/>
-          <w:lang w:val="es-ES"/>
-        </w:rPr>
-        <w:t>En memoria se almacenan la asignación actual (una lista por camión con los paquetes asignados) y las cargas actuales de cada camión. El espacio máximo usado en cualquier momento es proporcional al número de paquetes por el número de camiones. Adicionalmente, la recursión genera una pila de llamadas de profundidad máxima n, por lo que el espacio de la pila también es O(n).</w:t>
-      </w:r>
-    </w:p>
-    <w:p>
-      <w:pPr>
-        <w:numPr>
-          <w:ilvl w:val="0"/>
-          <w:numId w:val="0"/>
-        </w:numPr>
-        <w:ind w:leftChars="0"/>
-        <w:jc w:val="left"/>
-        <w:rPr>
-          <w:rFonts w:hint="default"/>
-          <w:b w:val="0"/>
-          <w:bCs w:val="0"/>
-          <w:sz w:val="24"/>
-          <w:szCs w:val="24"/>
-          <w:lang w:val="es-ES"/>
-        </w:rPr>
-      </w:pPr>
-    </w:p>
-    <w:p>
-      <w:pPr>
-        <w:numPr>
-          <w:ilvl w:val="0"/>
-          <w:numId w:val="0"/>
-        </w:numPr>
-        <w:ind w:leftChars="0"/>
-        <w:jc w:val="left"/>
-        <w:rPr>
-          <w:rFonts w:hint="default"/>
+          <w:lang w:val="es-ES"/>
+        </w:rPr>
+        <w:t>n</w:t>
+      </w:r>
+      <w:r>
+        <w:rPr>
+          <w:rFonts w:hint="default" w:ascii="Calibri" w:hAnsi="Calibri" w:cs="Calibri"/>
+        </w:rPr>
+        <w:t xml:space="preserve"> paquetes, lo que genera </w:t>
+      </w:r>
+      <w:r>
+        <w:rPr>
+          <w:rStyle w:val="5"/>
+          <w:rFonts w:hint="default" w:ascii="Calibri" w:hAnsi="Calibri" w:cs="Calibri"/>
           <w:b/>
           <w:bCs/>
-          <w:sz w:val="28"/>
-          <w:szCs w:val="28"/>
-          <w:lang w:val="es-ES"/>
-        </w:rPr>
-      </w:pPr>
-      <w:r>
-        <w:rPr>
-          <w:rFonts w:hint="default"/>
-          <w:b/>
-          <w:bCs/>
-          <w:sz w:val="28"/>
-          <w:szCs w:val="28"/>
-          <w:lang w:val="es-ES"/>
+          <w:sz w:val="24"/>
+          <w:szCs w:val="24"/>
+        </w:rPr>
+        <w:t>(m+1)^n</w:t>
+      </w:r>
+      <w:r>
+        <w:rPr>
+          <w:rFonts w:hint="default" w:ascii="Calibri" w:hAnsi="Calibri" w:cs="Calibri"/>
+          <w:sz w:val="24"/>
+          <w:szCs w:val="24"/>
+        </w:rPr>
+        <w:t xml:space="preserve"> </w:t>
+      </w:r>
+      <w:r>
+        <w:rPr>
+          <w:rFonts w:hint="default" w:ascii="Calibri" w:hAnsi="Calibri" w:cs="Calibri"/>
+        </w:rPr>
+        <w:t>combinaciones en total.</w:t>
+      </w:r>
+    </w:p>
+    <w:p>
+      <w:pPr>
+        <w:pStyle w:val="8"/>
+        <w:keepNext w:val="0"/>
+        <w:keepLines w:val="0"/>
+        <w:widowControl/>
+        <w:suppressLineNumbers w:val="0"/>
+        <w:spacing w:before="0" w:beforeAutospacing="1" w:after="0" w:afterAutospacing="1"/>
+        <w:ind w:left="0" w:right="0"/>
+        <w:rPr>
+          <w:rFonts w:hint="default" w:ascii="Calibri" w:hAnsi="Calibri" w:cs="Calibri"/>
+        </w:rPr>
+      </w:pPr>
+    </w:p>
+    <w:p>
+      <w:pPr>
+        <w:pStyle w:val="8"/>
+        <w:keepNext w:val="0"/>
+        <w:keepLines w:val="0"/>
+        <w:widowControl/>
+        <w:suppressLineNumbers w:val="0"/>
+        <w:spacing w:before="0" w:beforeAutospacing="1" w:after="0" w:afterAutospacing="1"/>
+        <w:ind w:left="0" w:right="0"/>
+        <w:rPr>
+          <w:rFonts w:hint="default" w:ascii="Calibri" w:hAnsi="Calibri" w:cs="Calibri"/>
+        </w:rPr>
+      </w:pPr>
+      <w:r>
+        <w:rPr>
+          <w:rFonts w:hint="default" w:ascii="Calibri" w:hAnsi="Calibri" w:cs="Calibri"/>
+        </w:rPr>
+        <w:t>Por ejemplo</w:t>
+      </w:r>
+      <w:r>
+        <w:rPr>
+          <w:rFonts w:hint="default" w:ascii="Calibri" w:hAnsi="Calibri" w:cs="Calibri"/>
+          <w:lang w:val="es-ES"/>
+        </w:rPr>
+        <w:t>:</w:t>
+      </w:r>
+      <w:r>
+        <w:rPr>
+          <w:rFonts w:hint="default" w:ascii="Calibri" w:hAnsi="Calibri" w:cs="Calibri"/>
+          <w:lang w:val="es-ES"/>
+        </w:rPr>
+        <w:br w:type="textWrapping"/>
+      </w:r>
+      <w:r>
+        <w:rPr>
+          <w:rFonts w:hint="default" w:ascii="Calibri" w:hAnsi="Calibri" w:cs="Calibri"/>
+          <w:lang w:val="es-ES"/>
+        </w:rPr>
+        <w:t>C</w:t>
+      </w:r>
+      <w:r>
+        <w:rPr>
+          <w:rFonts w:hint="default" w:ascii="Calibri" w:hAnsi="Calibri" w:cs="Calibri"/>
+        </w:rPr>
+        <w:t>on 5 paquetes y 2 camiones</w:t>
+      </w:r>
+      <w:r>
+        <w:rPr>
+          <w:rFonts w:hint="default" w:ascii="Calibri" w:hAnsi="Calibri" w:cs="Calibri"/>
+          <w:lang w:val="es-ES"/>
+        </w:rPr>
+        <w:t xml:space="preserve"> (caso pequeño) </w:t>
+      </w:r>
+      <w:r>
+        <w:rPr>
+          <w:rFonts w:hint="default" w:ascii="Calibri" w:hAnsi="Calibri" w:cs="Calibri"/>
+        </w:rPr>
+        <w:t xml:space="preserve">se exploran 3^5 = 243 combinaciones. </w:t>
+      </w:r>
+    </w:p>
+    <w:p>
+      <w:pPr>
+        <w:pStyle w:val="8"/>
+        <w:keepNext w:val="0"/>
+        <w:keepLines w:val="0"/>
+        <w:widowControl/>
+        <w:suppressLineNumbers w:val="0"/>
+        <w:spacing w:before="0" w:beforeAutospacing="1" w:after="0" w:afterAutospacing="1"/>
+        <w:ind w:left="0" w:right="0"/>
+        <w:rPr>
+          <w:rFonts w:hint="default" w:ascii="Calibri" w:hAnsi="Calibri" w:cs="Calibri"/>
+        </w:rPr>
+      </w:pPr>
+      <w:r>
+        <w:rPr>
+          <w:rFonts w:hint="default" w:ascii="Calibri" w:hAnsi="Calibri" w:cs="Calibri"/>
+        </w:rPr>
+        <w:t xml:space="preserve">Con 15 paquetes y 4 camiones </w:t>
+      </w:r>
+      <w:r>
+        <w:rPr>
+          <w:rFonts w:hint="default" w:ascii="Calibri" w:hAnsi="Calibri" w:cs="Calibri"/>
+          <w:lang w:val="es-ES"/>
+        </w:rPr>
+        <w:t xml:space="preserve">(caso mediano) </w:t>
+      </w:r>
+      <w:r>
+        <w:rPr>
+          <w:rFonts w:hint="default" w:ascii="Calibri" w:hAnsi="Calibri" w:cs="Calibri"/>
+        </w:rPr>
+        <w:t>se exploran 5^15 = 30</w:t>
+      </w:r>
+      <w:r>
+        <w:rPr>
+          <w:rFonts w:hint="default" w:ascii="Calibri" w:hAnsi="Calibri" w:cs="Calibri"/>
+          <w:lang w:val="es-ES"/>
+        </w:rPr>
+        <w:t>.</w:t>
+      </w:r>
+      <w:r>
+        <w:rPr>
+          <w:rFonts w:hint="default" w:ascii="Calibri" w:hAnsi="Calibri" w:cs="Calibri"/>
+        </w:rPr>
+        <w:t>517</w:t>
+      </w:r>
+      <w:r>
+        <w:rPr>
+          <w:rFonts w:hint="default" w:ascii="Calibri" w:hAnsi="Calibri" w:cs="Calibri"/>
+          <w:lang w:val="es-ES"/>
+        </w:rPr>
+        <w:t>.</w:t>
+      </w:r>
+      <w:r>
+        <w:rPr>
+          <w:rFonts w:hint="default" w:ascii="Calibri" w:hAnsi="Calibri" w:cs="Calibri"/>
+        </w:rPr>
+        <w:t>578</w:t>
+      </w:r>
+      <w:r>
+        <w:rPr>
+          <w:rFonts w:hint="default" w:ascii="Calibri" w:hAnsi="Calibri" w:cs="Calibri"/>
+          <w:lang w:val="es-ES"/>
+        </w:rPr>
+        <w:t>.</w:t>
+      </w:r>
+      <w:r>
+        <w:rPr>
+          <w:rFonts w:hint="default" w:ascii="Calibri" w:hAnsi="Calibri" w:cs="Calibri"/>
+        </w:rPr>
+        <w:t xml:space="preserve">125 combinaciones. </w:t>
+      </w:r>
+    </w:p>
+    <w:p>
+      <w:pPr>
+        <w:pStyle w:val="8"/>
+        <w:keepNext w:val="0"/>
+        <w:keepLines w:val="0"/>
+        <w:widowControl/>
+        <w:suppressLineNumbers w:val="0"/>
+        <w:spacing w:before="0" w:beforeAutospacing="1" w:after="0" w:afterAutospacing="1"/>
+        <w:ind w:left="0" w:right="0"/>
+        <w:rPr>
+          <w:rFonts w:hint="default" w:ascii="Calibri" w:hAnsi="Calibri" w:cs="Calibri"/>
+        </w:rPr>
+      </w:pPr>
+      <w:r>
+        <w:rPr>
+          <w:rFonts w:hint="default" w:ascii="Calibri" w:hAnsi="Calibri" w:cs="Calibri"/>
+        </w:rPr>
+        <w:t xml:space="preserve">Con 40 paquetes y 8 camiones </w:t>
+      </w:r>
+      <w:r>
+        <w:rPr>
+          <w:rFonts w:hint="default" w:ascii="Calibri" w:hAnsi="Calibri" w:cs="Calibri"/>
+          <w:lang w:val="es-ES"/>
+        </w:rPr>
+        <w:t xml:space="preserve">(caso grande) </w:t>
+      </w:r>
+      <w:r>
+        <w:rPr>
+          <w:rFonts w:hint="default" w:ascii="Calibri" w:hAnsi="Calibri" w:cs="Calibri"/>
+        </w:rPr>
+        <w:t xml:space="preserve">se exploran 9^40 combinaciones, </w:t>
+      </w:r>
+    </w:p>
+    <w:p>
+      <w:pPr>
+        <w:pStyle w:val="8"/>
+        <w:keepNext w:val="0"/>
+        <w:keepLines w:val="0"/>
+        <w:widowControl/>
+        <w:suppressLineNumbers w:val="0"/>
+        <w:spacing w:before="0" w:beforeAutospacing="1" w:after="0" w:afterAutospacing="1"/>
+        <w:ind w:left="0" w:right="0"/>
+        <w:rPr>
+          <w:rFonts w:hint="default" w:ascii="Calibri" w:hAnsi="Calibri" w:cs="Calibri"/>
+        </w:rPr>
+      </w:pPr>
+      <w:r>
+        <w:rPr>
+          <w:rFonts w:hint="default" w:ascii="Calibri" w:hAnsi="Calibri" w:cs="Calibri"/>
+        </w:rPr>
+        <w:t>un número tan grande que es computacionalmente inviable, es por eso que el sistema no arroja ningún resultado.</w:t>
+      </w:r>
+    </w:p>
+    <w:p>
+      <w:pPr>
+        <w:pStyle w:val="8"/>
+        <w:keepNext w:val="0"/>
+        <w:keepLines w:val="0"/>
+        <w:widowControl/>
+        <w:suppressLineNumbers w:val="0"/>
+        <w:spacing w:before="0" w:beforeAutospacing="1" w:after="0" w:afterAutospacing="1"/>
+        <w:ind w:left="0" w:right="0"/>
+        <w:rPr>
+          <w:rFonts w:hint="default" w:ascii="Calibri" w:hAnsi="Calibri" w:cs="Calibri"/>
+        </w:rPr>
+      </w:pPr>
+      <w:r>
+        <w:rPr>
+          <w:rStyle w:val="6"/>
+          <w:rFonts w:hint="default" w:ascii="Calibri" w:hAnsi="Calibri" w:cs="Calibri"/>
+        </w:rPr>
+        <w:t>Complejidad espacial: O(n * m)</w:t>
+      </w:r>
+    </w:p>
+    <w:p>
+      <w:pPr>
+        <w:pStyle w:val="8"/>
+        <w:keepNext w:val="0"/>
+        <w:keepLines w:val="0"/>
+        <w:widowControl/>
+        <w:suppressLineNumbers w:val="0"/>
+        <w:spacing w:before="0" w:beforeAutospacing="1" w:after="0" w:afterAutospacing="1"/>
+        <w:ind w:left="0" w:right="0"/>
+        <w:rPr>
+          <w:rFonts w:hint="default" w:ascii="Calibri" w:hAnsi="Calibri" w:cs="Calibri"/>
+        </w:rPr>
+      </w:pPr>
+      <w:r>
+        <w:rPr>
+          <w:rFonts w:hint="default" w:ascii="Calibri" w:hAnsi="Calibri" w:cs="Calibri"/>
+        </w:rPr>
+        <w:t>En memoria se almacenan la asignación actual (una lista por camión con los paquetes asignados) y las cargas actuales de cada camión. El espacio máximo usado en cualquier momento es proporcional al número de paquetes por el número de camiones.</w:t>
+      </w:r>
+    </w:p>
+    <w:p>
+      <w:pPr>
+        <w:pStyle w:val="8"/>
+        <w:keepNext w:val="0"/>
+        <w:keepLines w:val="0"/>
+        <w:widowControl/>
+        <w:suppressLineNumbers w:val="0"/>
+        <w:spacing w:before="0" w:beforeAutospacing="1" w:after="0" w:afterAutospacing="1"/>
+        <w:ind w:left="0" w:right="0"/>
+        <w:rPr>
+          <w:rFonts w:hint="default" w:ascii="Calibri" w:hAnsi="Calibri" w:cs="Calibri"/>
+          <w:sz w:val="24"/>
+          <w:szCs w:val="24"/>
+        </w:rPr>
+      </w:pPr>
+      <w:r>
+        <w:rPr>
+          <w:rStyle w:val="6"/>
+          <w:rFonts w:hint="default" w:ascii="Calibri" w:hAnsi="Calibri" w:cs="Calibri"/>
+          <w:sz w:val="24"/>
+          <w:szCs w:val="24"/>
         </w:rPr>
         <w:t>Justificación paso a paso:</w:t>
       </w:r>
@@ -2165,45 +2316,37 @@
       </w:pPr>
       <w:r>
         <w:rPr>
-          <w:rFonts w:hint="default" w:ascii="Calibri" w:hAnsi="Calibri" w:cs="Calibri"/>
-          <w:sz w:val="24"/>
-          <w:szCs w:val="24"/>
-        </w:rPr>
-        <w:t xml:space="preserve">La función </w:t>
-      </w:r>
-      <w:r>
-        <w:rPr>
           <w:rStyle w:val="5"/>
           <w:rFonts w:hint="default" w:ascii="Calibri" w:hAnsi="Calibri" w:cs="Calibri"/>
           <w:sz w:val="24"/>
           <w:szCs w:val="24"/>
         </w:rPr>
-        <w:t>fuerza_bruta</w:t>
-      </w:r>
-      <w:r>
-        <w:rPr>
-          <w:rFonts w:hint="default" w:ascii="Calibri" w:hAnsi="Calibri" w:cs="Calibri"/>
-          <w:sz w:val="24"/>
-          <w:szCs w:val="24"/>
-        </w:rPr>
-        <w:t xml:space="preserve"> se llama recursivamente una vez por cada paquete</w:t>
-      </w:r>
-      <w:r>
-        <w:rPr>
-          <w:rFonts w:hint="default" w:ascii="Calibri" w:hAnsi="Calibri" w:cs="Calibri"/>
-          <w:sz w:val="24"/>
-          <w:szCs w:val="24"/>
-          <w:lang w:val="es-ES"/>
-        </w:rPr>
-        <w:t xml:space="preserve">: </w:t>
-      </w:r>
-      <w:r>
-        <w:rPr>
-          <w:rFonts w:hint="default" w:ascii="Calibri" w:hAnsi="Calibri" w:cs="Calibri"/>
-          <w:sz w:val="24"/>
-          <w:szCs w:val="24"/>
-        </w:rPr>
-        <w:t xml:space="preserve"> profundidad n</w:t>
+        <w:t>product(range(m+1), repeat=n)</w:t>
+      </w:r>
+      <w:r>
+        <w:rPr>
+          <w:rFonts w:hint="default" w:ascii="Calibri" w:hAnsi="Calibri" w:cs="Calibri"/>
+          <w:sz w:val="24"/>
+          <w:szCs w:val="24"/>
+        </w:rPr>
+        <w:t xml:space="preserve"> genera </w:t>
+      </w:r>
+      <w:r>
+        <w:rPr>
+          <w:rStyle w:val="5"/>
+          <w:rFonts w:hint="default" w:ascii="Calibri" w:hAnsi="Calibri" w:cs="Calibri"/>
+          <w:sz w:val="24"/>
+          <w:szCs w:val="24"/>
+        </w:rPr>
+        <w:t>(m+1)^n</w:t>
+      </w:r>
+      <w:r>
+        <w:rPr>
+          <w:rFonts w:hint="default" w:ascii="Calibri" w:hAnsi="Calibri" w:cs="Calibri"/>
+          <w:sz w:val="24"/>
+          <w:szCs w:val="24"/>
+        </w:rPr>
+        <w:t xml:space="preserve"> combinaciones en total</w:t>
       </w:r>
     </w:p>
     <w:p>
@@ -2230,24 +2373,26 @@
           <w:sz w:val="24"/>
           <w:szCs w:val="24"/>
         </w:rPr>
-        <w:t xml:space="preserve">En cada llamada se itera sobre los </w:t>
+        <w:t xml:space="preserve">Por cada combinación se itera sobre los </w:t>
       </w:r>
       <w:r>
         <w:rPr>
           <w:rStyle w:val="5"/>
           <w:rFonts w:hint="default" w:ascii="Calibri" w:hAnsi="Calibri" w:cs="Calibri"/>
-          <w:sz w:val="24"/>
-          <w:szCs w:val="24"/>
-        </w:rPr>
-        <w:t>m</w:t>
-      </w:r>
-      <w:r>
-        <w:rPr>
-          <w:rFonts w:hint="default" w:ascii="Calibri" w:hAnsi="Calibri" w:cs="Calibri"/>
-          <w:sz w:val="24"/>
-          <w:szCs w:val="24"/>
-        </w:rPr>
-        <w:t xml:space="preserve"> camiones</w:t>
+          <w:b/>
+          <w:bCs/>
+          <w:sz w:val="24"/>
+          <w:szCs w:val="24"/>
+        </w:rPr>
+        <w:t>n</w:t>
+      </w:r>
+      <w:r>
+        <w:rPr>
+          <w:rFonts w:hint="default" w:ascii="Calibri" w:hAnsi="Calibri" w:cs="Calibri"/>
+          <w:sz w:val="24"/>
+          <w:szCs w:val="24"/>
+        </w:rPr>
+        <w:t xml:space="preserve"> paquetes para validar capacidad</w:t>
       </w:r>
       <w:r>
         <w:rPr>
@@ -2264,7 +2409,7 @@
           <w:sz w:val="24"/>
           <w:szCs w:val="24"/>
         </w:rPr>
-        <w:t xml:space="preserve"> m ramas por nivel</w:t>
+        <w:t>O(n)</w:t>
       </w:r>
     </w:p>
     <w:p>
@@ -2291,7 +2436,41 @@
           <w:sz w:val="24"/>
           <w:szCs w:val="24"/>
         </w:rPr>
-        <w:t>El árbol de recursión tiene m^n hojas en el peor caso</w:t>
+        <w:t xml:space="preserve">Por cada combinación válida se recorren los </w:t>
+      </w:r>
+      <w:r>
+        <w:rPr>
+          <w:rStyle w:val="5"/>
+          <w:rFonts w:hint="default" w:ascii="Calibri" w:hAnsi="Calibri" w:cs="Calibri"/>
+          <w:sz w:val="24"/>
+          <w:szCs w:val="24"/>
+        </w:rPr>
+        <w:t>m</w:t>
+      </w:r>
+      <w:r>
+        <w:rPr>
+          <w:rFonts w:hint="default" w:ascii="Calibri" w:hAnsi="Calibri" w:cs="Calibri"/>
+          <w:sz w:val="24"/>
+          <w:szCs w:val="24"/>
+        </w:rPr>
+        <w:t xml:space="preserve"> camiones para guardar el resultado</w:t>
+      </w:r>
+      <w:r>
+        <w:rPr>
+          <w:rFonts w:hint="default" w:ascii="Calibri" w:hAnsi="Calibri" w:cs="Calibri"/>
+          <w:sz w:val="24"/>
+          <w:szCs w:val="24"/>
+          <w:lang w:val="es-ES"/>
+        </w:rPr>
+        <w:t>:</w:t>
+      </w:r>
+      <w:r>
+        <w:rPr>
+          <w:rFonts w:hint="default" w:ascii="Calibri" w:hAnsi="Calibri" w:cs="Calibri"/>
+          <w:sz w:val="24"/>
+          <w:szCs w:val="24"/>
+        </w:rPr>
+        <w:t xml:space="preserve"> O(m)</w:t>
       </w:r>
     </w:p>
     <w:p>
@@ -2308,34 +2487,20 @@
         <w:ind w:left="720" w:hanging="360"/>
         <w:rPr>
           <w:rFonts w:hint="default" w:ascii="Calibri" w:hAnsi="Calibri" w:cs="Calibri"/>
-          <w:sz w:val="24"/>
-          <w:szCs w:val="24"/>
-        </w:rPr>
-      </w:pPr>
-      <w:r>
-        <w:rPr>
-          <w:rFonts w:hint="default" w:ascii="Calibri" w:hAnsi="Calibri" w:cs="Calibri"/>
-          <w:sz w:val="24"/>
-          <w:szCs w:val="24"/>
-        </w:rPr>
-        <w:t>En cada hoja se evalúa si la solución es mejor</w:t>
-      </w:r>
-      <w:r>
-        <w:rPr>
-          <w:rFonts w:hint="default" w:ascii="Calibri" w:hAnsi="Calibri" w:cs="Calibri"/>
-          <w:sz w:val="24"/>
-          <w:szCs w:val="24"/>
-          <w:lang w:val="es-ES"/>
-        </w:rPr>
-        <w:t>:</w:t>
-      </w:r>
-      <w:r>
-        <w:rPr>
-          <w:rFonts w:hint="default" w:ascii="Calibri" w:hAnsi="Calibri" w:cs="Calibri"/>
-          <w:sz w:val="24"/>
-          <w:szCs w:val="24"/>
-        </w:rPr>
-        <w:t xml:space="preserve"> O(1)</w:t>
+          <w:b/>
+          <w:bCs/>
+          <w:sz w:val="28"/>
+          <w:szCs w:val="28"/>
+          <w:lang w:val="es-ES"/>
+        </w:rPr>
+      </w:pPr>
+      <w:r>
+        <w:rPr>
+          <w:rFonts w:hint="default" w:ascii="Calibri" w:hAnsi="Calibri" w:cs="Calibri"/>
+          <w:sz w:val="24"/>
+          <w:szCs w:val="24"/>
+        </w:rPr>
+        <w:t>Total por combinación: O(n + m)</w:t>
       </w:r>
     </w:p>
     <w:p>
@@ -2345,32 +2510,6 @@
         <w:widowControl/>
         <w:numPr>
           <w:ilvl w:val="0"/>
-          <w:numId w:val="4"/>
-        </w:numPr>
-        <w:suppressLineNumbers w:val="0"/>
-        <w:spacing w:before="0" w:beforeAutospacing="1" w:after="0" w:afterAutospacing="1"/>
-        <w:ind w:left="720" w:hanging="360"/>
-        <w:rPr>
-          <w:rFonts w:hint="default" w:ascii="Calibri" w:hAnsi="Calibri" w:cs="Calibri"/>
-          <w:sz w:val="24"/>
-          <w:szCs w:val="24"/>
-        </w:rPr>
-      </w:pPr>
-      <w:r>
-        <w:rPr>
-          <w:rFonts w:hint="default" w:ascii="Calibri" w:hAnsi="Calibri" w:cs="Calibri"/>
-          <w:sz w:val="24"/>
-          <w:szCs w:val="24"/>
-        </w:rPr>
-        <w:t>Total: O(m^n)</w:t>
-      </w:r>
-    </w:p>
-    <w:p>
-      <w:pPr>
-        <w:keepNext w:val="0"/>
-        <w:keepLines w:val="0"/>
-        <w:widowControl/>
-        <w:numPr>
           <w:numId w:val="0"/>
         </w:numPr>
         <w:suppressLineNumbers w:val="0"/>
@@ -2409,7 +2548,7 @@
     <w:tbl>
       <w:tblPr>
         <w:tblStyle w:val="9"/>
-        <w:tblW w:w="0" w:type="auto"/>
+        <w:tblW w:w="8993" w:type="dxa"/>
         <w:tblInd w:w="0" w:type="dxa"/>
         <w:tblBorders>
           <w:top w:val="single" w:color="auto" w:sz="4" w:space="0"/>
@@ -2421,7 +2560,9 @@
         </w:tblBorders>
         <w:tblLayout w:type="autofit"/>
         <w:tblCellMar>
+          <w:top w:w="0" w:type="dxa"/>
           <w:left w:w="108" w:type="dxa"/>
+          <w:bottom w:w="0" w:type="dxa"/>
           <w:right w:w="108" w:type="dxa"/>
         </w:tblCellMar>
       </w:tblPr>
@@ -2429,8 +2570,8 @@
         <w:gridCol w:w="1534"/>
         <w:gridCol w:w="1549"/>
         <w:gridCol w:w="1563"/>
-        <w:gridCol w:w="2330"/>
-        <w:gridCol w:w="1546"/>
+        <w:gridCol w:w="2634"/>
+        <w:gridCol w:w="1713"/>
       </w:tblGrid>
       <w:tr>
         <w:tblPrEx>
@@ -2443,13 +2584,15 @@
             <w:insideV w:val="single" w:color="auto" w:sz="4" w:space="0"/>
           </w:tblBorders>
           <w:tblCellMar>
+            <w:top w:w="0" w:type="dxa"/>
             <w:left w:w="108" w:type="dxa"/>
+            <w:bottom w:w="0" w:type="dxa"/>
             <w:right w:w="108" w:type="dxa"/>
           </w:tblCellMar>
         </w:tblPrEx>
         <w:tc>
           <w:tcPr>
-            <w:tcW w:w="1704" w:type="dxa"/>
+            <w:tcW w:w="1534" w:type="dxa"/>
           </w:tcPr>
           <w:p>
             <w:pPr>
@@ -2457,6 +2600,7 @@
               <w:keepLines w:val="0"/>
               <w:widowControl/>
               <w:numPr>
+                <w:ilvl w:val="0"/>
                 <w:numId w:val="0"/>
               </w:numPr>
               <w:suppressLineNumbers w:val="0"/>
@@ -2488,7 +2632,7 @@
         </w:tc>
         <w:tc>
           <w:tcPr>
-            <w:tcW w:w="1704" w:type="dxa"/>
+            <w:tcW w:w="1549" w:type="dxa"/>
           </w:tcPr>
           <w:p>
             <w:pPr>
@@ -2496,6 +2640,7 @@
               <w:keepLines w:val="0"/>
               <w:widowControl/>
               <w:numPr>
+                <w:ilvl w:val="0"/>
                 <w:numId w:val="0"/>
               </w:numPr>
               <w:suppressLineNumbers w:val="0"/>
@@ -2527,7 +2672,7 @@
         </w:tc>
         <w:tc>
           <w:tcPr>
-            <w:tcW w:w="1704" w:type="dxa"/>
+            <w:tcW w:w="1563" w:type="dxa"/>
           </w:tcPr>
           <w:p>
             <w:pPr>
@@ -2535,6 +2680,7 @@
               <w:keepLines w:val="0"/>
               <w:widowControl/>
               <w:numPr>
+                <w:ilvl w:val="0"/>
                 <w:numId w:val="0"/>
               </w:numPr>
               <w:suppressLineNumbers w:val="0"/>
@@ -2566,7 +2712,7 @@
         </w:tc>
         <w:tc>
           <w:tcPr>
-            <w:tcW w:w="1705" w:type="dxa"/>
+            <w:tcW w:w="2634" w:type="dxa"/>
           </w:tcPr>
           <w:p>
             <w:pPr>
@@ -2574,6 +2720,7 @@
               <w:keepLines w:val="0"/>
               <w:widowControl/>
               <w:numPr>
+                <w:ilvl w:val="0"/>
                 <w:numId w:val="0"/>
               </w:numPr>
               <w:suppressLineNumbers w:val="0"/>
@@ -2605,7 +2752,7 @@
         </w:tc>
         <w:tc>
           <w:tcPr>
-            <w:tcW w:w="1705" w:type="dxa"/>
+            <w:tcW w:w="1713" w:type="dxa"/>
           </w:tcPr>
           <w:p>
             <w:pPr>
@@ -2613,6 +2760,7 @@
               <w:keepLines w:val="0"/>
               <w:widowControl/>
               <w:numPr>
+                <w:ilvl w:val="0"/>
                 <w:numId w:val="0"/>
               </w:numPr>
               <w:suppressLineNumbers w:val="0"/>
@@ -2654,13 +2802,15 @@
             <w:insideV w:val="single" w:color="auto" w:sz="4" w:space="0"/>
           </w:tblBorders>
           <w:tblCellMar>
+            <w:top w:w="0" w:type="dxa"/>
             <w:left w:w="108" w:type="dxa"/>
+            <w:bottom w:w="0" w:type="dxa"/>
             <w:right w:w="108" w:type="dxa"/>
           </w:tblCellMar>
         </w:tblPrEx>
         <w:tc>
           <w:tcPr>
-            <w:tcW w:w="1704" w:type="dxa"/>
+            <w:tcW w:w="1534" w:type="dxa"/>
           </w:tcPr>
           <w:p>
             <w:pPr>
@@ -2668,10 +2818,12 @@
               <w:keepLines w:val="0"/>
               <w:widowControl/>
               <w:numPr>
+                <w:ilvl w:val="0"/>
                 <w:numId w:val="0"/>
               </w:numPr>
               <w:suppressLineNumbers w:val="0"/>
               <w:spacing w:before="0" w:beforeAutospacing="1" w:after="0" w:afterAutospacing="1"/>
+              <w:jc w:val="both"/>
               <w:rPr>
                 <w:rFonts w:hint="default" w:ascii="Calibri" w:hAnsi="Calibri" w:cs="Calibri"/>
                 <w:b w:val="0"/>
@@ -2698,7 +2850,7 @@
         </w:tc>
         <w:tc>
           <w:tcPr>
-            <w:tcW w:w="1704" w:type="dxa"/>
+            <w:tcW w:w="1549" w:type="dxa"/>
           </w:tcPr>
           <w:p>
             <w:pPr>
@@ -2706,10 +2858,12 @@
               <w:keepLines w:val="0"/>
               <w:widowControl/>
               <w:numPr>
+                <w:ilvl w:val="0"/>
                 <w:numId w:val="0"/>
               </w:numPr>
               <w:suppressLineNumbers w:val="0"/>
               <w:spacing w:before="0" w:beforeAutospacing="1" w:after="0" w:afterAutospacing="1"/>
+              <w:jc w:val="both"/>
               <w:rPr>
                 <w:rFonts w:hint="default" w:ascii="Calibri" w:hAnsi="Calibri" w:cs="Calibri"/>
                 <w:b w:val="0"/>
@@ -2736,7 +2890,7 @@
         </w:tc>
         <w:tc>
           <w:tcPr>
-            <w:tcW w:w="1704" w:type="dxa"/>
+            <w:tcW w:w="1563" w:type="dxa"/>
           </w:tcPr>
           <w:p>
             <w:pPr>
@@ -2744,10 +2898,12 @@
               <w:keepLines w:val="0"/>
               <w:widowControl/>
               <w:numPr>
+                <w:ilvl w:val="0"/>
                 <w:numId w:val="0"/>
               </w:numPr>
               <w:suppressLineNumbers w:val="0"/>
               <w:spacing w:before="0" w:beforeAutospacing="1" w:after="0" w:afterAutospacing="1"/>
+              <w:jc w:val="both"/>
               <w:rPr>
                 <w:rFonts w:hint="default" w:ascii="Calibri" w:hAnsi="Calibri" w:cs="Calibri"/>
                 <w:b w:val="0"/>
@@ -2774,7 +2930,7 @@
         </w:tc>
         <w:tc>
           <w:tcPr>
-            <w:tcW w:w="1705" w:type="dxa"/>
+            <w:tcW w:w="2634" w:type="dxa"/>
           </w:tcPr>
           <w:p>
             <w:pPr>
@@ -2782,10 +2938,12 @@
               <w:keepLines w:val="0"/>
               <w:widowControl/>
               <w:numPr>
+                <w:ilvl w:val="0"/>
                 <w:numId w:val="0"/>
               </w:numPr>
               <w:suppressLineNumbers w:val="0"/>
               <w:spacing w:before="0" w:beforeAutospacing="1" w:after="0" w:afterAutospacing="1"/>
+              <w:jc w:val="both"/>
               <w:rPr>
                 <w:rFonts w:hint="default" w:ascii="Calibri" w:hAnsi="Calibri" w:cs="Calibri"/>
                 <w:b w:val="0"/>
@@ -2812,7 +2970,7 @@
         </w:tc>
         <w:tc>
           <w:tcPr>
-            <w:tcW w:w="1705" w:type="dxa"/>
+            <w:tcW w:w="1713" w:type="dxa"/>
           </w:tcPr>
           <w:p>
             <w:pPr>
@@ -2820,10 +2978,12 @@
               <w:keepLines w:val="0"/>
               <w:widowControl/>
               <w:numPr>
+                <w:ilvl w:val="0"/>
                 <w:numId w:val="0"/>
               </w:numPr>
               <w:suppressLineNumbers w:val="0"/>
               <w:spacing w:before="0" w:beforeAutospacing="1" w:after="0" w:afterAutospacing="1"/>
+              <w:jc w:val="both"/>
               <w:rPr>
                 <w:rFonts w:hint="default" w:ascii="Calibri" w:hAnsi="Calibri" w:cs="Calibri"/>
                 <w:b w:val="0"/>
@@ -2840,7 +3000,7 @@
                 <w:sz w:val="24"/>
                 <w:szCs w:val="24"/>
               </w:rPr>
-              <w:t>0.000123 seg</w:t>
+              <w:t>0.000443 seg</w:t>
             </w:r>
           </w:p>
         </w:tc>
@@ -2856,13 +3016,15 @@
             <w:insideV w:val="single" w:color="auto" w:sz="4" w:space="0"/>
           </w:tblBorders>
           <w:tblCellMar>
+            <w:top w:w="0" w:type="dxa"/>
             <w:left w:w="108" w:type="dxa"/>
+            <w:bottom w:w="0" w:type="dxa"/>
             <w:right w:w="108" w:type="dxa"/>
           </w:tblCellMar>
         </w:tblPrEx>
         <w:tc>
           <w:tcPr>
-            <w:tcW w:w="1704" w:type="dxa"/>
+            <w:tcW w:w="1534" w:type="dxa"/>
           </w:tcPr>
           <w:p>
             <w:pPr>
@@ -2870,10 +3032,12 @@
               <w:keepLines w:val="0"/>
               <w:widowControl/>
               <w:numPr>
+                <w:ilvl w:val="0"/>
                 <w:numId w:val="0"/>
               </w:numPr>
               <w:suppressLineNumbers w:val="0"/>
               <w:spacing w:before="0" w:beforeAutospacing="1" w:after="0" w:afterAutospacing="1"/>
+              <w:jc w:val="both"/>
               <w:rPr>
                 <w:rFonts w:hint="default" w:ascii="Calibri" w:hAnsi="Calibri" w:cs="Calibri"/>
                 <w:b w:val="0"/>
@@ -2900,7 +3064,7 @@
         </w:tc>
         <w:tc>
           <w:tcPr>
-            <w:tcW w:w="1704" w:type="dxa"/>
+            <w:tcW w:w="1549" w:type="dxa"/>
           </w:tcPr>
           <w:p>
             <w:pPr>
@@ -2908,10 +3072,12 @@
               <w:keepLines w:val="0"/>
               <w:widowControl/>
               <w:numPr>
+                <w:ilvl w:val="0"/>
                 <w:numId w:val="0"/>
               </w:numPr>
               <w:suppressLineNumbers w:val="0"/>
               <w:spacing w:before="0" w:beforeAutospacing="1" w:after="0" w:afterAutospacing="1"/>
+              <w:jc w:val="both"/>
               <w:rPr>
                 <w:rFonts w:hint="default" w:ascii="Calibri" w:hAnsi="Calibri" w:cs="Calibri"/>
                 <w:b w:val="0"/>
@@ -2938,7 +3104,7 @@
         </w:tc>
         <w:tc>
           <w:tcPr>
-            <w:tcW w:w="1704" w:type="dxa"/>
+            <w:tcW w:w="1563" w:type="dxa"/>
           </w:tcPr>
           <w:p>
             <w:pPr>
@@ -2946,10 +3112,12 @@
               <w:keepLines w:val="0"/>
               <w:widowControl/>
               <w:numPr>
+                <w:ilvl w:val="0"/>
                 <w:numId w:val="0"/>
               </w:numPr>
               <w:suppressLineNumbers w:val="0"/>
               <w:spacing w:before="0" w:beforeAutospacing="1" w:after="0" w:afterAutospacing="1"/>
+              <w:jc w:val="both"/>
               <w:rPr>
                 <w:rFonts w:hint="default" w:ascii="Calibri" w:hAnsi="Calibri" w:cs="Calibri"/>
                 <w:b w:val="0"/>
@@ -2976,7 +3144,7 @@
         </w:tc>
         <w:tc>
           <w:tcPr>
-            <w:tcW w:w="1705" w:type="dxa"/>
+            <w:tcW w:w="2634" w:type="dxa"/>
           </w:tcPr>
           <w:p>
             <w:pPr>
@@ -2984,10 +3152,12 @@
               <w:keepLines w:val="0"/>
               <w:widowControl/>
               <w:numPr>
+                <w:ilvl w:val="0"/>
                 <w:numId w:val="0"/>
               </w:numPr>
               <w:suppressLineNumbers w:val="0"/>
               <w:spacing w:before="0" w:beforeAutospacing="1" w:after="0" w:afterAutospacing="1"/>
+              <w:jc w:val="both"/>
               <w:rPr>
                 <w:rFonts w:hint="default" w:ascii="Calibri" w:hAnsi="Calibri" w:cs="Calibri"/>
                 <w:b w:val="0"/>
@@ -3008,24 +3178,72 @@
                 <w:vertAlign w:val="baseline"/>
                 <w:lang w:val="es-ES"/>
               </w:rPr>
-              <w:t xml:space="preserve">4^15 = </w:t>
+              <w:t xml:space="preserve">5^15 = </w:t>
             </w:r>
             <w:r>
               <w:rPr>
                 <w:rFonts w:hint="default" w:ascii="Calibri" w:hAnsi="Calibri" w:cs="Calibri"/>
-                <w:b w:val="0"/>
-                <w:bCs w:val="0"/>
-                <w:sz w:val="24"/>
-                <w:szCs w:val="24"/>
-                <w:lang w:val="es-ES"/>
-              </w:rPr>
-              <w:t>1073741824</w:t>
+                <w:sz w:val="24"/>
+                <w:szCs w:val="24"/>
+              </w:rPr>
+              <w:t>30</w:t>
+            </w:r>
+            <w:r>
+              <w:rPr>
+                <w:rFonts w:hint="default" w:ascii="Calibri" w:hAnsi="Calibri" w:cs="Calibri"/>
+                <w:sz w:val="24"/>
+                <w:szCs w:val="24"/>
+                <w:lang w:val="es-ES"/>
+              </w:rPr>
+              <w:t>.</w:t>
+            </w:r>
+            <w:r>
+              <w:rPr>
+                <w:rFonts w:hint="default" w:ascii="Calibri" w:hAnsi="Calibri" w:cs="Calibri"/>
+                <w:sz w:val="24"/>
+                <w:szCs w:val="24"/>
+              </w:rPr>
+              <w:t>517</w:t>
+            </w:r>
+            <w:r>
+              <w:rPr>
+                <w:rFonts w:hint="default" w:ascii="Calibri" w:hAnsi="Calibri" w:cs="Calibri"/>
+                <w:sz w:val="24"/>
+                <w:szCs w:val="24"/>
+                <w:lang w:val="es-ES"/>
+              </w:rPr>
+              <w:t>.</w:t>
+            </w:r>
+            <w:r>
+              <w:rPr>
+                <w:rFonts w:hint="default" w:ascii="Calibri" w:hAnsi="Calibri" w:cs="Calibri"/>
+                <w:sz w:val="24"/>
+                <w:szCs w:val="24"/>
+              </w:rPr>
+              <w:t>578</w:t>
+            </w:r>
+            <w:r>
+              <w:rPr>
+                <w:rFonts w:hint="default" w:ascii="Calibri" w:hAnsi="Calibri" w:cs="Calibri"/>
+                <w:sz w:val="24"/>
+                <w:szCs w:val="24"/>
+                <w:lang w:val="es-ES"/>
+              </w:rPr>
+              <w:t>.</w:t>
+            </w:r>
+            <w:r>
+              <w:rPr>
+                <w:rFonts w:hint="default" w:ascii="Calibri" w:hAnsi="Calibri" w:cs="Calibri"/>
+                <w:sz w:val="24"/>
+                <w:szCs w:val="24"/>
+              </w:rPr>
+              <w:t>125</w:t>
             </w:r>
           </w:p>
         </w:tc>
         <w:tc>
           <w:tcPr>
-            <w:tcW w:w="1705" w:type="dxa"/>
+            <w:tcW w:w="1713" w:type="dxa"/>
           </w:tcPr>
           <w:p>
             <w:pPr>
@@ -3033,10 +3251,12 @@
               <w:keepLines w:val="0"/>
               <w:widowControl/>
               <w:numPr>
+                <w:ilvl w:val="0"/>
                 <w:numId w:val="0"/>
               </w:numPr>
               <w:suppressLineNumbers w:val="0"/>
               <w:spacing w:before="0" w:beforeAutospacing="1" w:after="0" w:afterAutospacing="1"/>
+              <w:jc w:val="both"/>
               <w:rPr>
                 <w:rFonts w:hint="default" w:ascii="Calibri" w:hAnsi="Calibri" w:cs="Calibri"/>
                 <w:b w:val="0"/>
@@ -3052,8 +3272,9 @@
                 <w:rFonts w:hint="default" w:ascii="Calibri" w:hAnsi="Calibri" w:eastAsia="SimSun" w:cs="Calibri"/>
                 <w:sz w:val="24"/>
                 <w:szCs w:val="24"/>
-              </w:rPr>
-              <w:t>80.95 seg</w:t>
+                <w:lang w:val="es-ES"/>
+              </w:rPr>
+              <w:t>No termina</w:t>
             </w:r>
           </w:p>
         </w:tc>
@@ -3069,13 +3290,15 @@
             <w:insideV w:val="single" w:color="auto" w:sz="4" w:space="0"/>
           </w:tblBorders>
           <w:tblCellMar>
+            <w:top w:w="0" w:type="dxa"/>
             <w:left w:w="108" w:type="dxa"/>
+            <w:bottom w:w="0" w:type="dxa"/>
             <w:right w:w="108" w:type="dxa"/>
           </w:tblCellMar>
         </w:tblPrEx>
         <w:tc>
           <w:tcPr>
-            <w:tcW w:w="1704" w:type="dxa"/>
+            <w:tcW w:w="1534" w:type="dxa"/>
           </w:tcPr>
           <w:p>
             <w:pPr>
@@ -3083,10 +3306,12 @@
               <w:keepLines w:val="0"/>
               <w:widowControl/>
               <w:numPr>
+                <w:ilvl w:val="0"/>
                 <w:numId w:val="0"/>
               </w:numPr>
               <w:suppressLineNumbers w:val="0"/>
               <w:spacing w:before="0" w:beforeAutospacing="1" w:after="0" w:afterAutospacing="1"/>
+              <w:jc w:val="both"/>
               <w:rPr>
                 <w:rFonts w:hint="default" w:ascii="Calibri" w:hAnsi="Calibri" w:cs="Calibri"/>
                 <w:b w:val="0"/>
@@ -3113,7 +3338,7 @@
         </w:tc>
         <w:tc>
           <w:tcPr>
-            <w:tcW w:w="1704" w:type="dxa"/>
+            <w:tcW w:w="1549" w:type="dxa"/>
           </w:tcPr>
           <w:p>
             <w:pPr>
@@ -3121,10 +3346,12 @@
               <w:keepLines w:val="0"/>
               <w:widowControl/>
               <w:numPr>
+                <w:ilvl w:val="0"/>
                 <w:numId w:val="0"/>
               </w:numPr>
               <w:suppressLineNumbers w:val="0"/>
               <w:spacing w:before="0" w:beforeAutospacing="1" w:after="0" w:afterAutospacing="1"/>
+              <w:jc w:val="both"/>
               <w:rPr>
                 <w:rFonts w:hint="default" w:ascii="Calibri" w:hAnsi="Calibri" w:cs="Calibri"/>
                 <w:b w:val="0"/>
@@ -3151,7 +3378,7 @@
         </w:tc>
         <w:tc>
           <w:tcPr>
-            <w:tcW w:w="1704" w:type="dxa"/>
+            <w:tcW w:w="1563" w:type="dxa"/>
           </w:tcPr>
           <w:p>
             <w:pPr>
@@ -3159,10 +3386,12 @@
               <w:keepLines w:val="0"/>
               <w:widowControl/>
               <w:numPr>
+                <w:ilvl w:val="0"/>
                 <w:numId w:val="0"/>
               </w:numPr>
               <w:suppressLineNumbers w:val="0"/>
               <w:spacing w:before="0" w:beforeAutospacing="1" w:after="0" w:afterAutospacing="1"/>
+              <w:jc w:val="both"/>
               <w:rPr>
                 <w:rFonts w:hint="default" w:ascii="Calibri" w:hAnsi="Calibri" w:cs="Calibri"/>
                 <w:b w:val="0"/>
@@ -3189,7 +3418,7 @@
         </w:tc>
         <w:tc>
           <w:tcPr>
-            <w:tcW w:w="1705" w:type="dxa"/>
+            <w:tcW w:w="2634" w:type="dxa"/>
           </w:tcPr>
           <w:p>
             <w:pPr>
@@ -3197,10 +3426,12 @@
               <w:keepLines w:val="0"/>
               <w:widowControl/>
               <w:numPr>
+                <w:ilvl w:val="0"/>
                 <w:numId w:val="0"/>
               </w:numPr>
               <w:suppressLineNumbers w:val="0"/>
               <w:spacing w:before="0" w:beforeAutospacing="1" w:after="0" w:afterAutospacing="1"/>
+              <w:jc w:val="both"/>
               <w:rPr>
                 <w:rFonts w:hint="default" w:ascii="Calibri" w:hAnsi="Calibri" w:cs="Calibri"/>
                 <w:b w:val="0"/>
@@ -3221,7 +3452,7 @@
                 <w:vertAlign w:val="baseline"/>
                 <w:lang w:val="es-ES"/>
               </w:rPr>
-              <w:t xml:space="preserve">8 ^ 40 </w:t>
+              <w:t xml:space="preserve">9 ^ 40 </w:t>
             </w:r>
             <w:r>
               <w:rPr>
@@ -3244,7 +3475,7 @@
         </w:tc>
         <w:tc>
           <w:tcPr>
-            <w:tcW w:w="1705" w:type="dxa"/>
+            <w:tcW w:w="1713" w:type="dxa"/>
           </w:tcPr>
           <w:p>
             <w:pPr>
@@ -3252,10 +3483,12 @@
               <w:keepLines w:val="0"/>
               <w:widowControl/>
               <w:numPr>
+                <w:ilvl w:val="0"/>
                 <w:numId w:val="0"/>
               </w:numPr>
               <w:suppressLineNumbers w:val="0"/>
               <w:spacing w:before="0" w:beforeAutospacing="1" w:after="0" w:afterAutospacing="1"/>
+              <w:jc w:val="both"/>
               <w:rPr>
                 <w:rFonts w:hint="default" w:ascii="Calibri" w:hAnsi="Calibri" w:cs="Calibri"/>
                 <w:b w:val="0"/>
@@ -3284,6 +3517,7 @@
         <w:keepLines w:val="0"/>
         <w:widowControl/>
         <w:numPr>
+          <w:ilvl w:val="0"/>
           <w:numId w:val="0"/>
         </w:numPr>
         <w:suppressLineNumbers w:val="0"/>
@@ -3306,7 +3540,20 @@
           <w:szCs w:val="24"/>
           <w:lang w:val="es-ES"/>
         </w:rPr>
-        <w:t>Los resultados confirman el comportamiento O(m^n): pasar de 5 a 15 paquetes multiplicó el tiempo de milisegundos a más de un minuto, y el caso grande no llega ni a un resultado visible.</w:t>
+        <w:t xml:space="preserve">La fuerza bruta solo es ejecutable en el </w:t>
+      </w:r>
+      <w:bookmarkStart w:id="0" w:name="_GoBack"/>
+      <w:bookmarkEnd w:id="0"/>
+      <w:r>
+        <w:rPr>
+          <w:rFonts w:hint="default" w:ascii="Calibri" w:hAnsi="Calibri" w:cs="Calibri"/>
+          <w:b w:val="0"/>
+          <w:bCs w:val="0"/>
+          <w:sz w:val="24"/>
+          <w:szCs w:val="24"/>
+          <w:lang w:val="es-ES"/>
+        </w:rPr>
+        <w:t>caso pequeño. A medida que aumentan los paquetes y camiones el tiempo crece de forma exponencial, haciendo imposible su uso en casos reales. Así se justifica la necesidad de usar algoritmos más eficientes como greedy, backtracking y divide y vencerás para los casos mediano y grande que veremos mas adelante.</w:t>
       </w:r>
     </w:p>
     <w:p>
@@ -3315,6 +3562,7 @@
         <w:keepLines w:val="0"/>
         <w:widowControl/>
         <w:numPr>
+          <w:ilvl w:val="0"/>
           <w:numId w:val="0"/>
         </w:numPr>
         <w:suppressLineNumbers w:val="0"/>
@@ -3335,6 +3583,7 @@
         <w:keepLines w:val="0"/>
         <w:widowControl/>
         <w:numPr>
+          <w:ilvl w:val="0"/>
           <w:numId w:val="0"/>
         </w:numPr>
         <w:suppressLineNumbers w:val="0"/>
@@ -3355,6 +3604,7 @@
         <w:keepLines w:val="0"/>
         <w:widowControl/>
         <w:numPr>
+          <w:ilvl w:val="0"/>
           <w:numId w:val="0"/>
         </w:numPr>
         <w:suppressLineNumbers w:val="0"/>
@@ -3375,6 +3625,7 @@
         <w:keepLines w:val="0"/>
         <w:widowControl/>
         <w:numPr>
+          <w:ilvl w:val="0"/>
           <w:numId w:val="0"/>
         </w:numPr>
         <w:suppressLineNumbers w:val="0"/>
@@ -3395,19 +3646,31 @@
         <w:keepLines w:val="0"/>
         <w:widowControl/>
         <w:numPr>
+          <w:ilvl w:val="0"/>
           <w:numId w:val="0"/>
         </w:numPr>
         <w:suppressLineNumbers w:val="0"/>
         <w:spacing w:before="0" w:beforeAutospacing="1" w:after="0" w:afterAutospacing="1"/>
         <w:rPr>
           <w:rFonts w:hint="default" w:ascii="Calibri" w:hAnsi="Calibri" w:cs="Calibri"/>
-          <w:b w:val="0"/>
-          <w:bCs w:val="0"/>
-          <w:sz w:val="24"/>
-          <w:szCs w:val="24"/>
-          <w:lang w:val="es-ES"/>
-        </w:rPr>
-      </w:pPr>
+          <w:b/>
+          <w:bCs/>
+          <w:sz w:val="28"/>
+          <w:szCs w:val="28"/>
+          <w:lang w:val="es-ES"/>
+        </w:rPr>
+      </w:pPr>
+      <w:r>
+        <w:rPr>
+          <w:rFonts w:hint="default" w:ascii="Calibri" w:hAnsi="Calibri" w:cs="Calibri"/>
+          <w:b/>
+          <w:bCs/>
+          <w:sz w:val="28"/>
+          <w:szCs w:val="28"/>
+          <w:lang w:val="es-ES"/>
+        </w:rPr>
+        <w:t>Gráfica comparativa (tiempo vs tamaño de entrada):</w:t>
+      </w:r>
     </w:p>
     <w:p>
       <w:pPr>
@@ -3415,116 +3678,18 @@
         <w:keepLines w:val="0"/>
         <w:widowControl/>
         <w:numPr>
+          <w:ilvl w:val="0"/>
           <w:numId w:val="0"/>
         </w:numPr>
         <w:suppressLineNumbers w:val="0"/>
         <w:spacing w:before="0" w:beforeAutospacing="1" w:after="0" w:afterAutospacing="1"/>
-        <w:rPr>
-          <w:rFonts w:hint="default" w:ascii="Calibri" w:hAnsi="Calibri" w:cs="Calibri"/>
-          <w:b w:val="0"/>
-          <w:bCs w:val="0"/>
-          <w:sz w:val="24"/>
-          <w:szCs w:val="24"/>
-          <w:lang w:val="es-ES"/>
-        </w:rPr>
-      </w:pPr>
-    </w:p>
-    <w:p>
-      <w:pPr>
-        <w:keepNext w:val="0"/>
-        <w:keepLines w:val="0"/>
-        <w:widowControl/>
-        <w:numPr>
-          <w:numId w:val="0"/>
-        </w:numPr>
-        <w:suppressLineNumbers w:val="0"/>
-        <w:spacing w:before="0" w:beforeAutospacing="1" w:after="0" w:afterAutospacing="1"/>
-        <w:rPr>
-          <w:rFonts w:hint="default" w:ascii="Calibri" w:hAnsi="Calibri" w:cs="Calibri"/>
-          <w:b w:val="0"/>
-          <w:bCs w:val="0"/>
-          <w:sz w:val="24"/>
-          <w:szCs w:val="24"/>
-          <w:lang w:val="es-ES"/>
-        </w:rPr>
-      </w:pPr>
-    </w:p>
-    <w:p>
-      <w:pPr>
-        <w:keepNext w:val="0"/>
-        <w:keepLines w:val="0"/>
-        <w:widowControl/>
-        <w:numPr>
-          <w:numId w:val="0"/>
-        </w:numPr>
-        <w:suppressLineNumbers w:val="0"/>
-        <w:spacing w:before="0" w:beforeAutospacing="1" w:after="0" w:afterAutospacing="1"/>
-        <w:rPr>
-          <w:rFonts w:hint="default" w:ascii="Calibri" w:hAnsi="Calibri" w:cs="Calibri"/>
-          <w:b w:val="0"/>
-          <w:bCs w:val="0"/>
-          <w:sz w:val="24"/>
-          <w:szCs w:val="24"/>
-          <w:lang w:val="es-ES"/>
-        </w:rPr>
-      </w:pPr>
-    </w:p>
-    <w:p>
-      <w:pPr>
-        <w:keepNext w:val="0"/>
-        <w:keepLines w:val="0"/>
-        <w:widowControl/>
-        <w:numPr>
-          <w:numId w:val="0"/>
-        </w:numPr>
-        <w:suppressLineNumbers w:val="0"/>
-        <w:spacing w:before="0" w:beforeAutospacing="1" w:after="0" w:afterAutospacing="1"/>
-        <w:rPr>
-          <w:rFonts w:hint="default" w:ascii="Calibri" w:hAnsi="Calibri" w:cs="Calibri"/>
-          <w:b/>
-          <w:bCs/>
-          <w:sz w:val="28"/>
-          <w:szCs w:val="28"/>
-          <w:lang w:val="es-ES"/>
-        </w:rPr>
-      </w:pPr>
-      <w:r>
-        <w:rPr>
-          <w:rFonts w:hint="default" w:ascii="Calibri" w:hAnsi="Calibri" w:cs="Calibri"/>
-          <w:b/>
-          <w:bCs/>
-          <w:sz w:val="28"/>
-          <w:szCs w:val="28"/>
-          <w:lang w:val="es-ES"/>
-        </w:rPr>
-        <w:t>Gráfica comparativa (tiempo vs tamaño de entrada):</w:t>
-      </w:r>
-    </w:p>
-    <w:p>
-      <w:pPr>
-        <w:keepNext w:val="0"/>
-        <w:keepLines w:val="0"/>
-        <w:widowControl/>
-        <w:numPr>
-          <w:numId w:val="0"/>
-        </w:numPr>
-        <w:suppressLineNumbers w:val="0"/>
-        <w:spacing w:before="0" w:beforeAutospacing="1" w:after="0" w:afterAutospacing="1"/>
-        <w:rPr>
-          <w:rFonts w:hint="default" w:ascii="Calibri" w:hAnsi="Calibri" w:cs="Calibri"/>
-          <w:b/>
-          <w:bCs/>
-          <w:sz w:val="28"/>
-          <w:szCs w:val="28"/>
-          <w:lang w:val="es-ES"/>
-        </w:rPr>
       </w:pPr>
       <w:r>
         <w:drawing>
           <wp:inline distT="0" distB="0" distL="114300" distR="114300">
-            <wp:extent cx="5267325" cy="3160395"/>
-            <wp:effectExtent l="0" t="0" r="9525" b="1905"/>
-            <wp:docPr id="1" name="Imagen 1"/>
+            <wp:extent cx="5271135" cy="3103880"/>
+            <wp:effectExtent l="0" t="0" r="5715" b="1270"/>
+            <wp:docPr id="2" name="Imagen 2"/>
             <wp:cNvGraphicFramePr>
               <a:graphicFrameLocks xmlns:a="http://schemas.openxmlformats.org/drawingml/2006/main" noChangeAspect="1"/>
             </wp:cNvGraphicFramePr>
@@ -3532,7 +3697,7 @@
               <a:graphicData uri="http://schemas.openxmlformats.org/drawingml/2006/picture">
                 <pic:pic xmlns:pic="http://schemas.openxmlformats.org/drawingml/2006/picture">
                   <pic:nvPicPr>
-                    <pic:cNvPr id="1" name="Imagen 1"/>
+                    <pic:cNvPr id="2" name="Imagen 2"/>
                     <pic:cNvPicPr>
                       <a:picLocks noChangeAspect="1"/>
                     </pic:cNvPicPr>
@@ -3546,7 +3711,7 @@
                   <pic:spPr>
                     <a:xfrm>
                       <a:off x="0" y="0"/>
-                      <a:ext cx="5267325" cy="3160395"/>
+                      <a:ext cx="5271135" cy="3103880"/>
                     </a:xfrm>
                     <a:prstGeom prst="rect">
                       <a:avLst/>
@@ -3562,8 +3727,6 @@
           </wp:inline>
         </w:drawing>
       </w:r>
-      <w:bookmarkStart w:id="0" w:name="_GoBack"/>
-      <w:bookmarkEnd w:id="0"/>
     </w:p>
     <w:p>
       <w:pPr>
@@ -3571,6 +3734,60 @@
         <w:keepLines w:val="0"/>
         <w:widowControl/>
         <w:numPr>
+          <w:ilvl w:val="0"/>
+          <w:numId w:val="0"/>
+        </w:numPr>
+        <w:suppressLineNumbers w:val="0"/>
+        <w:spacing w:before="0" w:beforeAutospacing="1" w:after="0" w:afterAutospacing="1"/>
+        <w:rPr>
+          <w:rFonts w:hint="default"/>
+          <w:b/>
+          <w:bCs/>
+          <w:sz w:val="28"/>
+          <w:szCs w:val="28"/>
+          <w:lang w:val="es-ES"/>
+        </w:rPr>
+      </w:pPr>
+      <w:r>
+        <w:rPr>
+          <w:rFonts w:hint="default"/>
+          <w:b/>
+          <w:bCs/>
+          <w:sz w:val="28"/>
+          <w:szCs w:val="28"/>
+          <w:lang w:val="es-ES"/>
+        </w:rPr>
+        <w:t>Solución recursiva:</w:t>
+      </w:r>
+    </w:p>
+    <w:p>
+      <w:pPr>
+        <w:keepNext w:val="0"/>
+        <w:keepLines w:val="0"/>
+        <w:widowControl/>
+        <w:numPr>
+          <w:ilvl w:val="0"/>
+          <w:numId w:val="0"/>
+        </w:numPr>
+        <w:suppressLineNumbers w:val="0"/>
+        <w:spacing w:before="0" w:beforeAutospacing="1" w:after="0" w:afterAutospacing="1"/>
+        <w:rPr>
+          <w:rFonts w:hint="default"/>
+          <w:b w:val="0"/>
+          <w:bCs w:val="0"/>
+          <w:sz w:val="22"/>
+          <w:szCs w:val="22"/>
+          <w:lang w:val="es-ES"/>
+        </w:rPr>
+      </w:pPr>
+    </w:p>
+    <w:p>
+      <w:pPr>
+        <w:keepNext w:val="0"/>
+        <w:keepLines w:val="0"/>
+        <w:widowControl/>
+        <w:numPr>
+          <w:ilvl w:val="0"/>
           <w:numId w:val="0"/>
         </w:numPr>
         <w:suppressLineNumbers w:val="0"/>
@@ -3777,6 +3994,155 @@
     </w:lvl>
   </w:abstractNum>
   <w:abstractNum w:abstractNumId="2">
+    <w:nsid w:val="EEB2CA3E"/>
+    <w:multiLevelType w:val="multilevel"/>
+    <w:tmpl w:val="EEB2CA3E"/>
+    <w:lvl w:ilvl="0" w:tentative="0">
+      <w:start w:val="1"/>
+      <w:numFmt w:val="decimal"/>
+      <w:lvlText w:val="%1."/>
+      <w:lvlJc w:val="left"/>
+      <w:pPr>
+        <w:tabs>
+          <w:tab w:val="left" w:pos="720"/>
+        </w:tabs>
+        <w:ind w:left="720" w:hanging="360"/>
+      </w:pPr>
+      <w:rPr>
+        <w:sz w:val="24"/>
+        <w:szCs w:val="24"/>
+      </w:rPr>
+    </w:lvl>
+    <w:lvl w:ilvl="1" w:tentative="0">
+      <w:start w:val="1"/>
+      <w:numFmt w:val="decimal"/>
+      <w:lvlText w:val="%2."/>
+      <w:lvlJc w:val="left"/>
+      <w:pPr>
+        <w:tabs>
+          <w:tab w:val="left" w:pos="1440"/>
+        </w:tabs>
+        <w:ind w:left="1440" w:hanging="360"/>
+      </w:pPr>
+      <w:rPr>
+        <w:sz w:val="24"/>
+        <w:szCs w:val="24"/>
+      </w:rPr>
+    </w:lvl>
+    <w:lvl w:ilvl="2" w:tentative="0">
+      <w:start w:val="1"/>
+      <w:numFmt w:val="decimal"/>
+      <w:lvlText w:val="%3."/>
+      <w:lvlJc w:val="left"/>
+      <w:pPr>
+        <w:tabs>
+          <w:tab w:val="left" w:pos="2160"/>
+        </w:tabs>
+        <w:ind w:left="2160" w:hanging="360"/>
+      </w:pPr>
+      <w:rPr>
+        <w:sz w:val="24"/>
+        <w:szCs w:val="24"/>
+      </w:rPr>
+    </w:lvl>
+    <w:lvl w:ilvl="3" w:tentative="0">
+      <w:start w:val="1"/>
+      <w:numFmt w:val="decimal"/>
+      <w:lvlText w:val="%4."/>
+      <w:lvlJc w:val="left"/>
+      <w:pPr>
+        <w:tabs>
+          <w:tab w:val="left" w:pos="2500"/>
+        </w:tabs>
+        <w:ind w:left="2880" w:hanging="360"/>
+      </w:pPr>
+      <w:rPr>
+        <w:sz w:val="24"/>
+        <w:szCs w:val="24"/>
+      </w:rPr>
+    </w:lvl>
+    <w:lvl w:ilvl="4" w:tentative="0">
+      <w:start w:val="1"/>
+      <w:numFmt w:val="decimal"/>
+      <w:lvlText w:val="%5."/>
+      <w:lvlJc w:val="left"/>
+      <w:pPr>
+        <w:tabs>
+          <w:tab w:val="left" w:pos="3220"/>
+        </w:tabs>
+        <w:ind w:left="3600" w:hanging="360"/>
+      </w:pPr>
+      <w:rPr>
+        <w:sz w:val="24"/>
+        <w:szCs w:val="24"/>
+      </w:rPr>
+    </w:lvl>
+    <w:lvl w:ilvl="5" w:tentative="0">
+      <w:start w:val="1"/>
+      <w:numFmt w:val="decimal"/>
+      <w:lvlText w:val="%6."/>
+      <w:lvlJc w:val="left"/>
+      <w:pPr>
+        <w:tabs>
+          <w:tab w:val="left" w:pos="3940"/>
+        </w:tabs>
+        <w:ind w:left="4320" w:hanging="360"/>
+      </w:pPr>
+      <w:rPr>
+        <w:sz w:val="24"/>
+        <w:szCs w:val="24"/>
+      </w:rPr>
+    </w:lvl>
+    <w:lvl w:ilvl="6" w:tentative="0">
+      <w:start w:val="1"/>
+      <w:numFmt w:val="decimal"/>
+      <w:lvlText w:val="%7."/>
+      <w:lvlJc w:val="left"/>
+      <w:pPr>
+        <w:tabs>
+          <w:tab w:val="left" w:pos="4660"/>
+        </w:tabs>
+        <w:ind w:left="5040" w:hanging="360"/>
+      </w:pPr>
+      <w:rPr>
+        <w:sz w:val="24"/>
+        <w:szCs w:val="24"/>
+      </w:rPr>
+    </w:lvl>
+    <w:lvl w:ilvl="7" w:tentative="0">
+      <w:start w:val="1"/>
+      <w:numFmt w:val="decimal"/>
+      <w:lvlText w:val="%8."/>
+      <w:lvlJc w:val="left"/>
+      <w:pPr>
+        <w:tabs>
+          <w:tab w:val="left" w:pos="5380"/>
+        </w:tabs>
+        <w:ind w:left="5760" w:hanging="360"/>
+      </w:pPr>
+      <w:rPr>
+        <w:sz w:val="24"/>
+        <w:szCs w:val="24"/>
+      </w:rPr>
+    </w:lvl>
+    <w:lvl w:ilvl="8" w:tentative="0">
+      <w:start w:val="1"/>
+      <w:numFmt w:val="decimal"/>
+      <w:lvlText w:val="%9."/>
+      <w:lvlJc w:val="left"/>
+      <w:pPr>
+        <w:tabs>
+          <w:tab w:val="left" w:pos="6100"/>
+        </w:tabs>
+        <w:ind w:left="6480" w:hanging="360"/>
+      </w:pPr>
+      <w:rPr>
+        <w:sz w:val="24"/>
+        <w:szCs w:val="24"/>
+      </w:rPr>
+    </w:lvl>
+  </w:abstractNum>
+  <w:abstractNum w:abstractNumId="3">
     <w:nsid w:val="13F78198"/>
     <w:multiLevelType w:val="multilevel"/>
     <w:tmpl w:val="13F78198"/>
@@ -3925,166 +4291,17 @@
       </w:rPr>
     </w:lvl>
   </w:abstractNum>
-  <w:abstractNum w:abstractNumId="3">
-    <w:nsid w:val="5CB1D41F"/>
-    <w:multiLevelType w:val="multilevel"/>
-    <w:tmpl w:val="5CB1D41F"/>
-    <w:lvl w:ilvl="0" w:tentative="0">
-      <w:start w:val="1"/>
-      <w:numFmt w:val="decimal"/>
-      <w:lvlText w:val="%1."/>
-      <w:lvlJc w:val="left"/>
-      <w:pPr>
-        <w:tabs>
-          <w:tab w:val="left" w:pos="720"/>
-        </w:tabs>
-        <w:ind w:left="720" w:hanging="360"/>
-      </w:pPr>
-      <w:rPr>
-        <w:sz w:val="24"/>
-        <w:szCs w:val="24"/>
-      </w:rPr>
-    </w:lvl>
-    <w:lvl w:ilvl="1" w:tentative="0">
-      <w:start w:val="1"/>
-      <w:numFmt w:val="decimal"/>
-      <w:lvlText w:val="%2."/>
-      <w:lvlJc w:val="left"/>
-      <w:pPr>
-        <w:tabs>
-          <w:tab w:val="left" w:pos="1440"/>
-        </w:tabs>
-        <w:ind w:left="1440" w:hanging="360"/>
-      </w:pPr>
-      <w:rPr>
-        <w:sz w:val="24"/>
-        <w:szCs w:val="24"/>
-      </w:rPr>
-    </w:lvl>
-    <w:lvl w:ilvl="2" w:tentative="0">
-      <w:start w:val="1"/>
-      <w:numFmt w:val="decimal"/>
-      <w:lvlText w:val="%3."/>
-      <w:lvlJc w:val="left"/>
-      <w:pPr>
-        <w:tabs>
-          <w:tab w:val="left" w:pos="2160"/>
-        </w:tabs>
-        <w:ind w:left="2160" w:hanging="360"/>
-      </w:pPr>
-      <w:rPr>
-        <w:sz w:val="24"/>
-        <w:szCs w:val="24"/>
-      </w:rPr>
-    </w:lvl>
-    <w:lvl w:ilvl="3" w:tentative="0">
-      <w:start w:val="1"/>
-      <w:numFmt w:val="decimal"/>
-      <w:lvlText w:val="%4."/>
-      <w:lvlJc w:val="left"/>
-      <w:pPr>
-        <w:tabs>
-          <w:tab w:val="left" w:pos="2500"/>
-        </w:tabs>
-        <w:ind w:left="2880" w:hanging="360"/>
-      </w:pPr>
-      <w:rPr>
-        <w:sz w:val="24"/>
-        <w:szCs w:val="24"/>
-      </w:rPr>
-    </w:lvl>
-    <w:lvl w:ilvl="4" w:tentative="0">
-      <w:start w:val="1"/>
-      <w:numFmt w:val="decimal"/>
-      <w:lvlText w:val="%5."/>
-      <w:lvlJc w:val="left"/>
-      <w:pPr>
-        <w:tabs>
-          <w:tab w:val="left" w:pos="3220"/>
-        </w:tabs>
-        <w:ind w:left="3600" w:hanging="360"/>
-      </w:pPr>
-      <w:rPr>
-        <w:sz w:val="24"/>
-        <w:szCs w:val="24"/>
-      </w:rPr>
-    </w:lvl>
-    <w:lvl w:ilvl="5" w:tentative="0">
-      <w:start w:val="1"/>
-      <w:numFmt w:val="decimal"/>
-      <w:lvlText w:val="%6."/>
-      <w:lvlJc w:val="left"/>
-      <w:pPr>
-        <w:tabs>
-          <w:tab w:val="left" w:pos="3940"/>
-        </w:tabs>
-        <w:ind w:left="4320" w:hanging="360"/>
-      </w:pPr>
-      <w:rPr>
-        <w:sz w:val="24"/>
-        <w:szCs w:val="24"/>
-      </w:rPr>
-    </w:lvl>
-    <w:lvl w:ilvl="6" w:tentative="0">
-      <w:start w:val="1"/>
-      <w:numFmt w:val="decimal"/>
-      <w:lvlText w:val="%7."/>
-      <w:lvlJc w:val="left"/>
-      <w:pPr>
-        <w:tabs>
-          <w:tab w:val="left" w:pos="4660"/>
-        </w:tabs>
-        <w:ind w:left="5040" w:hanging="360"/>
-      </w:pPr>
-      <w:rPr>
-        <w:sz w:val="24"/>
-        <w:szCs w:val="24"/>
-      </w:rPr>
-    </w:lvl>
-    <w:lvl w:ilvl="7" w:tentative="0">
-      <w:start w:val="1"/>
-      <w:numFmt w:val="decimal"/>
-      <w:lvlText w:val="%8."/>
-      <w:lvlJc w:val="left"/>
-      <w:pPr>
-        <w:tabs>
-          <w:tab w:val="left" w:pos="5380"/>
-        </w:tabs>
-        <w:ind w:left="5760" w:hanging="360"/>
-      </w:pPr>
-      <w:rPr>
-        <w:sz w:val="24"/>
-        <w:szCs w:val="24"/>
-      </w:rPr>
-    </w:lvl>
-    <w:lvl w:ilvl="8" w:tentative="0">
-      <w:start w:val="1"/>
-      <w:numFmt w:val="decimal"/>
-      <w:lvlText w:val="%9."/>
-      <w:lvlJc w:val="left"/>
-      <w:pPr>
-        <w:tabs>
-          <w:tab w:val="left" w:pos="6100"/>
-        </w:tabs>
-        <w:ind w:left="6480" w:hanging="360"/>
-      </w:pPr>
-      <w:rPr>
-        <w:sz w:val="24"/>
-        <w:szCs w:val="24"/>
-      </w:rPr>
-    </w:lvl>
-  </w:abstractNum>
   <w:num w:numId="1">
     <w:abstractNumId w:val="1"/>
   </w:num>
   <w:num w:numId="2">
-    <w:abstractNumId w:val="2"/>
+    <w:abstractNumId w:val="3"/>
   </w:num>
   <w:num w:numId="3">
     <w:abstractNumId w:val="0"/>
   </w:num>
   <w:num w:numId="4">
-    <w:abstractNumId w:val="3"/>
+    <w:abstractNumId w:val="2"/>
   </w:num>
 </w:numbering>
 </file>
@@ -4199,7 +4416,7 @@
     <w:lsdException w:qFormat="1" w:unhideWhenUsed="0" w:uiPriority="0" w:semiHidden="0" w:name="HTML Code"/>
     <w:lsdException w:unhideWhenUsed="0" w:uiPriority="0" w:semiHidden="0" w:name="HTML Definition"/>
     <w:lsdException w:unhideWhenUsed="0" w:uiPriority="0" w:semiHidden="0" w:name="HTML Keyboard"/>
-    <w:lsdException w:unhideWhenUsed="0" w:uiPriority="0" w:semiHidden="0" w:name="HTML Preformatted"/>
+    <w:lsdException w:qFormat="1" w:unhideWhenUsed="0" w:uiPriority="0" w:semiHidden="0" w:name="HTML Preformatted"/>
     <w:lsdException w:unhideWhenUsed="0" w:uiPriority="0" w:semiHidden="0" w:name="HTML Sample"/>
     <w:lsdException w:unhideWhenUsed="0" w:uiPriority="0" w:semiHidden="0" w:name="HTML Typewriter"/>
     <w:lsdException w:unhideWhenUsed="0" w:uiPriority="0" w:semiHidden="0" w:name="HTML Variable"/>
@@ -4326,6 +4543,7 @@
   </w:style>
   <w:style w:type="paragraph" w:styleId="7">
     <w:name w:val="HTML Preformatted"/>
+    <w:qFormat/>
     <w:uiPriority w:val="0"/>
     <w:pPr>
       <w:tabs>

</xml_diff>